<commit_message>
JCA submission: Vancouver bracket citations, metadata-driven cover letter, STROBE fixes
- Switch in-text citations to JCA Vancouver [n] format and expand ranges
  so middle references (e.g. Chen & Miao in [4-6]) are not dropped.
- Write jca_submission_metadata.json from create_jca_en.py and use it in
  create_jca_cover_letter.py so word/reference/table/figure counts are no
  longer hard-coded.
- Fix create_jca_strobe.py: handle pdftotext text=True stderr, drop trailing
  empty page from pdftotext output.
- Apply same STROBE/citation fixes to JECH scripts for consistency.
- Rebuild all JCA submission documents and zip.

Co-Authored-By: Tatsuki Onishi <bougtoir@gmail.com>
</commit_message>
<xml_diff>
--- a/documents/JCA/STROBE_checklist_JCA_EN.docx
+++ b/documents/JCA/STROBE_checklist_JCA_EN.docx
@@ -2398,7 +2398,7 @@
               <w:rPr>
                 <w:sz w:val="18"/>
               </w:rPr>
-              <w:t>12–14</w:t>
+              <w:t>12–15</w:t>
             </w:r>
           </w:p>
         </w:tc>
@@ -2470,7 +2470,7 @@
               <w:rPr>
                 <w:sz w:val="18"/>
               </w:rPr>
-              <w:t>12–14</w:t>
+              <w:t>12–15</w:t>
             </w:r>
           </w:p>
         </w:tc>
@@ -2542,7 +2542,7 @@
               <w:rPr>
                 <w:sz w:val="18"/>
               </w:rPr>
-              <w:t>12–14</w:t>
+              <w:t>12–15</w:t>
             </w:r>
           </w:p>
         </w:tc>
@@ -2614,7 +2614,7 @@
               <w:rPr>
                 <w:sz w:val="18"/>
               </w:rPr>
-              <w:t>12–14</w:t>
+              <w:t>12–15</w:t>
             </w:r>
           </w:p>
         </w:tc>

</xml_diff>

<commit_message>
JCA manuscript: tighten English phrasing after review
Co-Authored-By: Tatsuki Onishi <bougtoir@gmail.com>
</commit_message>
<xml_diff>
--- a/documents/JCA/STROBE_checklist_JCA_EN.docx
+++ b/documents/JCA/STROBE_checklist_JCA_EN.docx
@@ -2113,7 +2113,7 @@
               <w:rPr>
                 <w:sz w:val="18"/>
               </w:rPr>
-              <w:t>18–19</w:t>
+              <w:t>18</w:t>
             </w:r>
           </w:p>
         </w:tc>
@@ -2398,7 +2398,7 @@
               <w:rPr>
                 <w:sz w:val="18"/>
               </w:rPr>
-              <w:t>12–15</w:t>
+              <w:t>12–14</w:t>
             </w:r>
           </w:p>
         </w:tc>
@@ -2470,7 +2470,7 @@
               <w:rPr>
                 <w:sz w:val="18"/>
               </w:rPr>
-              <w:t>12–15</w:t>
+              <w:t>12–14</w:t>
             </w:r>
           </w:p>
         </w:tc>
@@ -2542,7 +2542,7 @@
               <w:rPr>
                 <w:sz w:val="18"/>
               </w:rPr>
-              <w:t>12–15</w:t>
+              <w:t>12–14</w:t>
             </w:r>
           </w:p>
         </w:tc>
@@ -2614,7 +2614,7 @@
               <w:rPr>
                 <w:sz w:val="18"/>
               </w:rPr>
-              <w:t>12–15</w:t>
+              <w:t>12–14</w:t>
             </w:r>
           </w:p>
         </w:tc>

</xml_diff>